<commit_message>
Add team and division-of-work slide after the cover; update speech script
Co-Authored-By: Claude Opus 5.5 <noreply@anthropic.com>
Claude-Session: https://claude.ai/code/session_01KJ328BptsMhS4rYwT6tCdN
</commit_message>
<xml_diff>
--- a/part1/Part1_演讲稿.docx
+++ b/part1/Part1_演讲稿.docx
@@ -17,7 +17,7 @@
           <w:color w:val="707070"/>
           <w:sz w:val="20"/>
         </w:rPr>
-        <w:t>课程：网络与新媒体营销 · 小组汇报（2026年10月20日） · 对应 PPT 第 1–6 页 · 建议时长 4.5 分钟（约 1,150 字，语速每分钟约 250 字）</w:t>
+        <w:t>课程：网络与新媒体营销 · 小组汇报（2026年10月20日） · 对应 PPT 第 1–7 页 · 建议时长约 5 分钟（约 1,600 字，语速每分钟约 250 字）</w:t>
       </w:r>
     </w:p>
     <w:p>
@@ -53,9 +53,38 @@
         <w:t>（停顿两秒，面向听众）各位老师、同学，大家好！我们小组今天的题目是：从内容平台到商业基础设施——抖音布局社交电商的动因、商业模式与发展前景。</w:t>
       </w:r>
     </w:p>
+    <w:p/>
+    <w:p>
+      <w:pPr>
+        <w:pStyle w:val="Heading1"/>
+      </w:pPr>
+      <w:r>
+        <w:t>第 2 页 Meet the Team: Who Covers What</w:t>
+      </w:r>
+    </w:p>
     <w:p>
       <w:r>
-        <w:t>我是第一部分的汇报人，主要负责交代研究背景：抖音电商是什么、怎么一步步发展过来的，以及它现在的布局。</w:t>
+        <w:rPr>
+          <w:i/>
+          <w:color w:val="707070"/>
+          <w:sz w:val="20"/>
+        </w:rPr>
+        <w:t>⏱ 约 25 秒</w:t>
+      </w:r>
+    </w:p>
+    <w:p>
+      <w:r>
+        <w:t>先介绍一下我们的分工。我是 A，负责第一部分：研究背景、核心概念，以及抖音电商的发展历程和当前布局，回答“是什么”。</w:t>
+      </w:r>
+    </w:p>
+    <w:p>
+      <w:r>
+        <w:t>B 同学负责第二部分，分析抖音进入电商的动因，回答“为什么”；C 同学负责第三部分，讲解商业模式和新媒体营销机制，回答“怎么做”；D 同学负责第四部分，分析存在的问题、未来前景并做总结，回答“往哪里去”。</w:t>
+      </w:r>
+    </w:p>
+    <w:p>
+      <w:r>
+        <w:t>（指向自己的卡片）下面由我开始第一部分。</w:t>
       </w:r>
     </w:p>
     <w:p>
@@ -63,7 +92,7 @@
         <w:pStyle w:val="Heading1"/>
       </w:pPr>
       <w:r>
-        <w:t>第 2 页 Roadmap &amp; Research Questions</w:t>
+        <w:t>第 3 页 Roadmap &amp; Research Questions</w:t>
       </w:r>
     </w:p>
     <w:p>
@@ -96,7 +125,7 @@
         <w:pStyle w:val="Heading1"/>
       </w:pPr>
       <w:r>
-        <w:t>第 3 页 Key Concepts: Who Finds Whom?</w:t>
+        <w:t>第 4 页 Key Concepts: Who Finds Whom?</w:t>
       </w:r>
     </w:p>
     <w:p>
@@ -139,7 +168,7 @@
         <w:pStyle w:val="Heading1"/>
       </w:pPr>
       <w:r>
-        <w:t>第 4 页 Evolution: From Traffic Referrer to Closed Loop</w:t>
+        <w:t>第 5 页 Evolution: From Traffic Referrer to Closed Loop</w:t>
       </w:r>
     </w:p>
     <w:p>
@@ -177,7 +206,7 @@
         <w:pStyle w:val="Heading1"/>
       </w:pPr>
       <w:r>
-        <w:t>第 5 页 Douyin Today: Scale That Sells</w:t>
+        <w:t>第 6 页 Douyin Today: Scale That Sells</w:t>
       </w:r>
     </w:p>
     <w:p>
@@ -215,7 +244,7 @@
         <w:pStyle w:val="Heading1"/>
       </w:pPr>
       <w:r>
-        <w:t>第 6 页 Current Layout: One App, Full Loop</w:t>
+        <w:t>第 7 页 Current Layout: One App, Full Loop</w:t>
       </w:r>
     </w:p>
     <w:p>

</xml_diff>

<commit_message>
Add Chinese version of Part 1 slides; align speech script headings
Co-Authored-By: Claude Opus 5.5 <noreply@anthropic.com>
Claude-Session: https://claude.ai/code/session_01KJ328BptsMhS4rYwT6tCdN
</commit_message>
<xml_diff>
--- a/part1/Part1_演讲稿.docx
+++ b/part1/Part1_演讲稿.docx
@@ -27,7 +27,7 @@
           <w:color w:val="707070"/>
           <w:sz w:val="20"/>
         </w:rPr>
-        <w:t>说明：括号内为动作或停顿提示；加粗英文是 PPT 上的关键词，讲到时可以用手势指向屏幕。</w:t>
+        <w:t>说明：括号内为动作或停顿提示；讲到 PPT 上的关键词和数字时，可以用手势指向屏幕。</w:t>
       </w:r>
     </w:p>
     <w:p>
@@ -35,7 +35,7 @@
         <w:pStyle w:val="Heading1"/>
       </w:pPr>
       <w:r>
-        <w:t>第 1 页 封面 · From Content Platform to Commerce Infrastructure</w:t>
+        <w:t>第 1 页 封面 · 从内容平台到商业基础设施</w:t>
       </w:r>
     </w:p>
     <w:p>
@@ -59,7 +59,7 @@
         <w:pStyle w:val="Heading1"/>
       </w:pPr>
       <w:r>
-        <w:t>第 2 页 Meet the Team: Who Covers What</w:t>
+        <w:t>第 2 页 小组分工：谁讲什么</w:t>
       </w:r>
     </w:p>
     <w:p>
@@ -92,7 +92,7 @@
         <w:pStyle w:val="Heading1"/>
       </w:pPr>
       <w:r>
-        <w:t>第 3 页 Roadmap &amp; Research Questions</w:t>
+        <w:t>第 3 页 汇报框架与研究问题</w:t>
       </w:r>
     </w:p>
     <w:p>
@@ -125,7 +125,7 @@
         <w:pStyle w:val="Heading1"/>
       </w:pPr>
       <w:r>
-        <w:t>第 4 页 Key Concepts: Who Finds Whom?</w:t>
+        <w:t>第 4 页 核心概念：谁在找谁？</w:t>
       </w:r>
     </w:p>
     <w:p>
@@ -168,7 +168,7 @@
         <w:pStyle w:val="Heading1"/>
       </w:pPr>
       <w:r>
-        <w:t>第 5 页 Evolution: From Traffic Referrer to Closed Loop</w:t>
+        <w:t>第 5 页 发展历程：从流量导流到交易闭环</w:t>
       </w:r>
     </w:p>
     <w:p>
@@ -206,7 +206,7 @@
         <w:pStyle w:val="Heading1"/>
       </w:pPr>
       <w:r>
-        <w:t>第 6 页 Douyin Today: Scale That Sells</w:t>
+        <w:t>第 6 页 今日抖音：规模即销量</w:t>
       </w:r>
     </w:p>
     <w:p>
@@ -244,7 +244,7 @@
         <w:pStyle w:val="Heading1"/>
       </w:pPr>
       <w:r>
-        <w:t>第 7 页 Current Layout: One App, Full Loop</w:t>
+        <w:t>第 7 页 当前布局：一个App，完整闭环</w:t>
       </w:r>
     </w:p>
     <w:p>

</xml_diff>